<commit_message>
Cambio en exportación de plan formativo. En vez de zip que sea un excel con los varios alumnos
</commit_message>
<xml_diff>
--- a/Recursos/Exportar/plantilla_word.docx
+++ b/Recursos/Exportar/plantilla_word.docx
@@ -46,7 +46,6 @@
         <w:t xml:space="preserve"> ${</w:t>
       </w:r>
       <w:proofErr w:type="spellStart"/>
-      <w:proofErr w:type="gramStart"/>
       <w:r>
         <w:rPr>
           <w:rFonts w:ascii="Courier New" w:hAnsi="Courier New" w:cs="Courier New"/>
@@ -73,17 +72,7 @@
           <w:szCs w:val="18"/>
           <w:lang w:val="es-ES"/>
         </w:rPr>
-        <w:t xml:space="preserve">   </w:t>
-      </w:r>
-      <w:proofErr w:type="gramEnd"/>
-      <w:r>
-        <w:rPr>
-          <w:rFonts w:ascii="Courier New" w:hAnsi="Courier New" w:cs="Courier New"/>
-          <w:sz w:val="18"/>
-          <w:szCs w:val="18"/>
-          <w:lang w:val="es-ES"/>
-        </w:rPr>
-        <w:t xml:space="preserve">   </w:t>
+        <w:t xml:space="preserve">      </w:t>
       </w:r>
       <w:r>
         <w:rPr>
@@ -106,7 +95,6 @@
         <w:t xml:space="preserve"> ${</w:t>
       </w:r>
       <w:proofErr w:type="spellStart"/>
-      <w:proofErr w:type="gramStart"/>
       <w:r>
         <w:rPr>
           <w:rFonts w:ascii="Courier New" w:hAnsi="Courier New" w:cs="Courier New"/>
@@ -133,17 +121,7 @@
           <w:szCs w:val="18"/>
           <w:lang w:val="es-ES"/>
         </w:rPr>
-        <w:t xml:space="preserve">   </w:t>
-      </w:r>
-      <w:proofErr w:type="gramEnd"/>
-      <w:r>
-        <w:rPr>
-          <w:rFonts w:ascii="Courier New" w:hAnsi="Courier New" w:cs="Courier New"/>
-          <w:sz w:val="18"/>
-          <w:szCs w:val="18"/>
-          <w:lang w:val="es-ES"/>
-        </w:rPr>
-        <w:t xml:space="preserve">   </w:t>
+        <w:t xml:space="preserve">      </w:t>
       </w:r>
       <w:r>
         <w:rPr>
@@ -166,7 +144,6 @@
         <w:t xml:space="preserve"> ${</w:t>
       </w:r>
       <w:proofErr w:type="spellStart"/>
-      <w:proofErr w:type="gramStart"/>
       <w:r>
         <w:rPr>
           <w:rFonts w:ascii="Courier New" w:hAnsi="Courier New" w:cs="Courier New"/>
@@ -202,17 +179,7 @@
           <w:szCs w:val="18"/>
           <w:lang w:val="es-ES"/>
         </w:rPr>
-        <w:t xml:space="preserve">  </w:t>
-      </w:r>
-      <w:proofErr w:type="gramEnd"/>
-      <w:r>
-        <w:rPr>
-          <w:rFonts w:ascii="Courier New" w:hAnsi="Courier New" w:cs="Courier New"/>
-          <w:sz w:val="18"/>
-          <w:szCs w:val="18"/>
-          <w:lang w:val="es-ES"/>
-        </w:rPr>
-        <w:t xml:space="preserve">   </w:t>
+        <w:t xml:space="preserve">     </w:t>
       </w:r>
       <w:r>
         <w:rPr>
@@ -1114,14 +1081,6 @@
         <w:b/>
       </w:rPr>
       <w:tab/>
-    </w:r>
-    <w:r>
-      <w:rPr>
-        <w:rFonts w:ascii="Serifa Th BT;Georgia" w:hAnsi="Serifa Th BT;Georgia" w:cs="Serifa Th BT;Georgia"/>
-        <w:b/>
-      </w:rPr>
-      <w:tab/>
-      <w:t xml:space="preserve">    </w:t>
     </w:r>
     <w:r>
       <w:rPr>
@@ -1553,7 +1512,7 @@
     <w:rPrDefault>
       <w:rPr>
         <w:rFonts w:ascii="Liberation Serif" w:eastAsia="Noto Serif CJK SC" w:hAnsi="Liberation Serif" w:cs="FreeSans"/>
-        <w:lang w:val="es-ES" w:eastAsia="es-ES" w:bidi="ar-SA"/>
+        <w:lang w:val="en-US" w:eastAsia="en-US" w:bidi="ar-SA"/>
       </w:rPr>
     </w:rPrDefault>
     <w:pPrDefault/>

</xml_diff>